<commit_message>
Migrate to katerinabischel/portfolio: update content and add 3D assets
- Update index.html, profile_photo.PNG, and resume
- Add donut.glb, donut.html, donut.png, seaweed.glb
- Add .gitignore excluding unreferenced donut_clean exports (44MB each)
- Update remote to katerinabischel/portfolio

Co-Authored-By: Claude Sonnet 4.6 <noreply@anthropic.com>
</commit_message>
<xml_diff>
--- a/Bischel_resume_AMS_format_2pp.docx
+++ b/Bischel_resume_AMS_format_2pp.docx
@@ -15,10 +15,10 @@
           <w:noProof/>
         </w:rPr>
         <w:drawing>
-          <wp:anchor distT="0" distB="0" distL="114300" distR="114300" simplePos="0" relativeHeight="251658240" behindDoc="0" locked="0" layoutInCell="1" allowOverlap="1" wp14:anchorId="4284D3CF" wp14:editId="5F6149FD">
+          <wp:anchor distT="0" distB="0" distL="114300" distR="114300" simplePos="0" relativeHeight="251658240" behindDoc="0" locked="0" layoutInCell="1" allowOverlap="1" wp14:anchorId="4284D3CF" wp14:editId="31757F23">
             <wp:simplePos x="0" y="0"/>
             <wp:positionH relativeFrom="column">
-              <wp:posOffset>5139055</wp:posOffset>
+              <wp:posOffset>5140960</wp:posOffset>
             </wp:positionH>
             <wp:positionV relativeFrom="paragraph">
               <wp:posOffset>0</wp:posOffset>
@@ -47,7 +47,7 @@
                         </a:ext>
                       </a:extLst>
                     </a:blip>
-                    <a:srcRect l="628" r="628"/>
+                    <a:srcRect l="414" r="414"/>
                     <a:stretch>
                       <a:fillRect/>
                     </a:stretch>

</xml_diff>